<commit_message>
260316F: dark mode log, red frag slider, bezoeker howto rewrite
</commit_message>
<xml_diff>
--- a/docs/howtos/HOE KAN IK KWAL.docx
+++ b/docs/howtos/HOE KAN IK KWAL.docx
@@ -204,7 +204,7 @@
           </mc:Choice>
           <mc:Fallback>
             <w:pict>
-              <v:oval w14:anchorId="16D2BC80" id="Oval 2" o:spid="_x0000_s1026" style="position:absolute;margin-left:48pt;margin-top:13.2pt;width:61.5pt;height:20pt;z-index:251660288;visibility:visible;mso-wrap-style:square;mso-height-percent:0;mso-wrap-distance-left:9pt;mso-wrap-distance-top:0;mso-wrap-distance-right:9pt;mso-wrap-distance-bottom:0;mso-position-horizontal:absolute;mso-position-horizontal-relative:text;mso-position-vertical:absolute;mso-position-vertical-relative:text;mso-height-percent:0;mso-height-relative:margin;v-text-anchor:middle" o:gfxdata="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" filled="f" strokecolor="#7030a0" strokeweight="1pt">
+              <v:oval w14:anchorId="76B03E40" id="Oval 2" o:spid="_x0000_s1026" style="position:absolute;margin-left:48pt;margin-top:13.2pt;width:61.5pt;height:20pt;z-index:251660288;visibility:visible;mso-wrap-style:square;mso-height-percent:0;mso-wrap-distance-left:9pt;mso-wrap-distance-top:0;mso-wrap-distance-right:9pt;mso-wrap-distance-bottom:0;mso-position-horizontal:absolute;mso-position-horizontal-relative:text;mso-position-vertical:absolute;mso-position-vertical-relative:text;mso-height-percent:0;mso-height-relative:margin;v-text-anchor:middle" o:gfxdata="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" filled="f" strokecolor="#7030a0" strokeweight="1pt">
                 <v:stroke joinstyle="miter"/>
               </v:oval>
             </w:pict>
@@ -342,6 +342,69 @@
         <w:spacing w:after="0" w:line="240" w:lineRule="auto"/>
       </w:pPr>
       <w:r>
+        <w:t xml:space="preserve">Klik </w:t>
+      </w:r>
+      <w:r>
+        <w:rPr>
+          <w:rFonts w:ascii="Segoe UI Emoji" w:hAnsi="Segoe UI Emoji" w:cs="Segoe UI Emoji"/>
+        </w:rPr>
+        <w:t>💡</w:t>
+      </w:r>
+      <w:r>
+        <w:t xml:space="preserve"> om </w:t>
+      </w:r>
+      <w:r>
+        <w:t>het</w:t>
+      </w:r>
+      <w:r>
+        <w:t xml:space="preserve"> </w:t>
+      </w:r>
+      <w:r>
+        <w:t>licht te dimmen</w:t>
+      </w:r>
+      <w:r>
+        <w:t>.</w:t>
+      </w:r>
+    </w:p>
+    <w:p>
+      <w:pPr>
+        <w:spacing w:after="0" w:line="240" w:lineRule="auto"/>
+      </w:pPr>
+      <w:r>
+        <w:t xml:space="preserve">Klik nogmaals </w:t>
+      </w:r>
+      <w:r>
+        <w:t xml:space="preserve"> op </w:t>
+      </w:r>
+      <w:r>
+        <w:rPr>
+          <w:rFonts w:ascii="Segoe UI Emoji" w:hAnsi="Segoe UI Emoji" w:cs="Segoe UI Emoji"/>
+        </w:rPr>
+        <w:t>💡</w:t>
+      </w:r>
+      <w:r>
+        <w:t xml:space="preserve"> </w:t>
+      </w:r>
+      <w:r>
+        <w:t xml:space="preserve">om </w:t>
+      </w:r>
+      <w:r>
+        <w:t>dimmen ongedaan te maken</w:t>
+      </w:r>
+      <w:r>
+        <w:t>.</w:t>
+      </w:r>
+    </w:p>
+    <w:p>
+      <w:pPr>
+        <w:spacing w:after="0" w:line="240" w:lineRule="auto"/>
+      </w:pPr>
+    </w:p>
+    <w:p>
+      <w:pPr>
+        <w:spacing w:after="0" w:line="240" w:lineRule="auto"/>
+      </w:pPr>
+      <w:r>
         <w:t>───────────────────────────────────────</w:t>
       </w:r>
     </w:p>
@@ -477,26 +540,6 @@
       <w:r>
         <w:t xml:space="preserve"> patroon-naam.</w:t>
       </w:r>
-    </w:p>
-    <w:p>
-      <w:pPr>
-        <w:spacing w:after="0" w:line="240" w:lineRule="auto"/>
-      </w:pPr>
-    </w:p>
-    <w:p>
-      <w:pPr>
-        <w:spacing w:after="0" w:line="240" w:lineRule="auto"/>
-      </w:pPr>
-    </w:p>
-    <w:p>
-      <w:pPr>
-        <w:spacing w:after="0" w:line="240" w:lineRule="auto"/>
-      </w:pPr>
-    </w:p>
-    <w:p>
-      <w:pPr>
-        <w:spacing w:after="0" w:line="240" w:lineRule="auto"/>
-      </w:pPr>
     </w:p>
     <w:p>
       <w:pPr>

</xml_diff>